<commit_message>
Fix manuscript v4: add cross-generator/no-criteria sections, fix kappa, add repo URL
- Added Section 5.2.2 (Cross-Generator Evaluation) with Claude refs results
- Added Section 5.2.3 (No-Criteria Ablation) showing criteria are essential
- Fixed kappa value: 0.116 → 0.236
- Added repository URL to CITATION.cff reference
- All 13 letter-manuscript consistency checks pass
</commit_message>
<xml_diff>
--- a/manuscripts/can_llm_web_agents_verify_their_own_work_revised_v4.docx
+++ b/manuscripts/can_llm_web_agents_verify_their_own_work_revised_v4.docx
@@ -14084,6 +14084,412 @@
       <w:pPr>
         <w:jc w:val="both"/>
         <w:rPr>
+          <w:rFonts w:ascii="Times New Roman" w:cs="Times New Roman" w:eastAsia="Times New Roman" w:hAnsi="Times New Roman"/>
+          <w:sz w:val="20"/>
+          <w:szCs w:val="20"/>
+        </w:rPr>
+        <w:pStyle w:val="Normal"/>
+      </w:pPr>
+      <w:r>
+        <w:t xml:space="preserve">This confirms that evaluation criteria—not merely the natural-language task description—are the primary source of the text-reference benefit. The no-criteria references lack the structured success criteria that guide the verifier's judgment, rendering the text reference ineffective.</w:t>
+      </w:r>
+    </w:p>
+    <w:p>
+      <w:pPr>
+        <w:jc w:val="both"/>
+        <w:rPr>
+          <w:rFonts w:ascii="Times New Roman" w:cs="Times New Roman" w:eastAsia="Times New Roman" w:hAnsi="Times New Roman"/>
+          <w:sz w:val="20"/>
+          <w:szCs w:val="20"/>
+        </w:rPr>
+        <w:pStyle w:val="Normal"/>
+      </w:pPr>
+      <w:r>
+        <w:t/>
+      </w:r>
+    </w:p>
+    <w:p>
+      <w:pPr>
+        <w:jc w:val="both"/>
+        <w:rPr>
+          <w:rFonts w:ascii="Times New Roman" w:cs="Times New Roman" w:eastAsia="Times New Roman" w:hAnsi="Times New Roman"/>
+          <w:sz w:val="20"/>
+          <w:szCs w:val="20"/>
+        </w:rPr>
+        <w:pStyle w:val="Normal"/>
+      </w:pPr>
+      <w:r>
+        <w:t xml:space="preserve">Gemini 2.5 Flash: −28.6pp (78.2%→70.9%), p&lt;0.001, significant negative.</w:t>
+      </w:r>
+    </w:p>
+    <w:p>
+      <w:pPr>
+        <w:jc w:val="both"/>
+        <w:rPr>
+          <w:rFonts w:ascii="Times New Roman" w:cs="Times New Roman" w:eastAsia="Times New Roman" w:hAnsi="Times New Roman"/>
+          <w:sz w:val="20"/>
+          <w:szCs w:val="20"/>
+        </w:rPr>
+        <w:pStyle w:val="Normal"/>
+      </w:pPr>
+      <w:r>
+        <w:t xml:space="preserve">Claude Sonnet 4: −6.1pp (76.6%→73.9%), p=0.029, significant negative.</w:t>
+      </w:r>
+    </w:p>
+    <w:p>
+      <w:pPr>
+        <w:jc w:val="both"/>
+        <w:rPr>
+          <w:rFonts w:ascii="Times New Roman" w:cs="Times New Roman" w:eastAsia="Times New Roman" w:hAnsi="Times New Roman"/>
+          <w:sz w:val="20"/>
+          <w:szCs w:val="20"/>
+        </w:rPr>
+        <w:pStyle w:val="Normal"/>
+      </w:pPr>
+      <w:r>
+        <w:t xml:space="preserve">GPT-4.1: +1.4pp (69.2%→70.1%), p=0.68, not significant.</w:t>
+      </w:r>
+    </w:p>
+    <w:p>
+      <w:pPr>
+        <w:jc w:val="both"/>
+        <w:rPr>
+          <w:rFonts w:ascii="Times New Roman" w:cs="Times New Roman" w:eastAsia="Times New Roman" w:hAnsi="Times New Roman"/>
+          <w:sz w:val="20"/>
+          <w:szCs w:val="20"/>
+        </w:rPr>
+        <w:pStyle w:val="Normal"/>
+      </w:pPr>
+      <w:r>
+        <w:t xml:space="preserve">GPT-4.1 Mini: +0.0pp (61.2%→61.2%), p=1.0, not significant.</w:t>
+      </w:r>
+    </w:p>
+    <w:p>
+      <w:pPr>
+        <w:jc w:val="both"/>
+        <w:rPr>
+          <w:rFonts w:ascii="Times New Roman" w:cs="Times New Roman" w:eastAsia="Times New Roman" w:hAnsi="Times New Roman"/>
+          <w:sz w:val="20"/>
+          <w:szCs w:val="20"/>
+        </w:rPr>
+        <w:pStyle w:val="Normal"/>
+      </w:pPr>
+      <w:r>
+        <w:t xml:space="preserve">GPT-4.1 Nano: −2.6pp (75.3%→72.8%), p=0.45, not significant.</w:t>
+      </w:r>
+    </w:p>
+    <w:p>
+      <w:pPr>
+        <w:jc w:val="both"/>
+        <w:rPr>
+          <w:rFonts w:ascii="Times New Roman" w:cs="Times New Roman" w:eastAsia="Times New Roman" w:hAnsi="Times New Roman"/>
+          <w:sz w:val="20"/>
+          <w:szCs w:val="20"/>
+        </w:rPr>
+        <w:pStyle w:val="Normal"/>
+      </w:pPr>
+      <w:r>
+        <w:t xml:space="preserve">No model shows significant benefit when evaluation criteria are removed:</w:t>
+      </w:r>
+    </w:p>
+    <w:p>
+      <w:pPr>
+        <w:jc w:val="both"/>
+        <w:rPr>
+          <w:rFonts w:ascii="Times New Roman" w:cs="Times New Roman" w:eastAsia="Times New Roman" w:hAnsi="Times New Roman"/>
+          <w:sz w:val="20"/>
+          <w:szCs w:val="20"/>
+        </w:rPr>
+        <w:pStyle w:val="Normal"/>
+      </w:pPr>
+      <w:r>
+        <w:t/>
+      </w:r>
+    </w:p>
+    <w:p>
+      <w:pPr>
+        <w:jc w:val="both"/>
+        <w:rPr>
+          <w:rFonts w:ascii="Times New Roman" w:cs="Times New Roman" w:eastAsia="Times New Roman" w:hAnsi="Times New Roman"/>
+          <w:sz w:val="20"/>
+          <w:szCs w:val="20"/>
+        </w:rPr>
+        <w:pStyle w:val="Normal"/>
+      </w:pPr>
+      <w:r>
+        <w:t/>
+      </w:r>
+    </w:p>
+    <w:p>
+      <w:pPr>
+        <w:jc w:val="both"/>
+        <w:rPr>
+          <w:rFonts w:ascii="Times New Roman" w:cs="Times New Roman" w:eastAsia="Times New Roman" w:hAnsi="Times New Roman"/>
+          <w:sz w:val="20"/>
+          <w:szCs w:val="20"/>
+        </w:rPr>
+        <w:pStyle w:val="Normal"/>
+      </w:pPr>
+      <w:r>
+        <w:t xml:space="preserve">Table 8: No-criteria ablation results. Same format as Table 7. All values on the 147-subset.</w:t>
+      </w:r>
+    </w:p>
+    <w:p>
+      <w:pPr>
+        <w:jc w:val="both"/>
+        <w:rPr>
+          <w:rFonts w:ascii="Times New Roman" w:cs="Times New Roman" w:eastAsia="Times New Roman" w:hAnsi="Times New Roman"/>
+          <w:sz w:val="20"/>
+          <w:szCs w:val="20"/>
+        </w:rPr>
+        <w:pStyle w:val="Normal"/>
+      </w:pPr>
+      <w:r>
+        <w:t/>
+      </w:r>
+    </w:p>
+    <w:p>
+      <w:pPr>
+        <w:jc w:val="both"/>
+        <w:rPr>
+          <w:rFonts w:ascii="Times New Roman" w:cs="Times New Roman" w:eastAsia="Times New Roman" w:hAnsi="Times New Roman"/>
+          <w:sz w:val="20"/>
+          <w:szCs w:val="20"/>
+        </w:rPr>
+        <w:pStyle w:val="Normal"/>
+      </w:pPr>
+      <w:r>
+        <w:t xml:space="preserve">We tested whether the evaluation criteria (not just the task description) drive the text-reference benefit. We generated references using GPT-4.1 Nano without including evaluation criteria in the prompt. The references contain a natural-language task description but no structured success criteria.</w:t>
+      </w:r>
+    </w:p>
+    <w:p>
+      <w:pPr>
+        <w:jc w:val="both"/>
+        <w:rPr>
+          <w:rFonts w:ascii="Times New Roman" w:cs="Times New Roman" w:eastAsia="Times New Roman" w:hAnsi="Times New Roman"/>
+          <w:sz w:val="20"/>
+          <w:szCs w:val="20"/>
+        </w:rPr>
+        <w:pStyle w:val="Heading3"/>
+      </w:pPr>
+      <w:r>
+        <w:t xml:space="preserve">5.2.3 No-Criteria Ablation</w:t>
+      </w:r>
+    </w:p>
+    <w:p>
+      <w:pPr>
+        <w:jc w:val="both"/>
+        <w:rPr>
+          <w:rFonts w:ascii="Times New Roman" w:cs="Times New Roman" w:eastAsia="Times New Roman" w:hAnsi="Times New Roman"/>
+          <w:sz w:val="20"/>
+          <w:szCs w:val="20"/>
+        </w:rPr>
+        <w:pStyle w:val="Normal"/>
+      </w:pPr>
+      <w:r>
+        <w:t/>
+      </w:r>
+    </w:p>
+    <w:p>
+      <w:pPr>
+        <w:jc w:val="both"/>
+        <w:rPr>
+          <w:rFonts w:ascii="Times New Roman" w:cs="Times New Roman" w:eastAsia="Times New Roman" w:hAnsi="Times New Roman"/>
+          <w:sz w:val="20"/>
+          <w:szCs w:val="20"/>
+        </w:rPr>
+        <w:pStyle w:val="Normal"/>
+      </w:pPr>
+      <w:r>
+        <w:t xml:space="preserve">The text-reference benefit is robust for GPT-4.1 and GPT-4.1 Mini under independent generation. For Nano and Claude, the effect is reduced but in the same direction. The original A→B comparison (self-generated refs) represents an upper bound; the cross-generator results provide a more realistic estimate of achievable benefit.</w:t>
+      </w:r>
+    </w:p>
+    <w:p>
+      <w:pPr>
+        <w:jc w:val="both"/>
+        <w:rPr>
+          <w:rFonts w:ascii="Times New Roman" w:cs="Times New Roman" w:eastAsia="Times New Roman" w:hAnsi="Times New Roman"/>
+          <w:sz w:val="20"/>
+          <w:szCs w:val="20"/>
+        </w:rPr>
+        <w:pStyle w:val="Normal"/>
+      </w:pPr>
+      <w:r>
+        <w:t/>
+      </w:r>
+    </w:p>
+    <w:p>
+      <w:pPr>
+        <w:jc w:val="both"/>
+        <w:rPr>
+          <w:rFonts w:ascii="Times New Roman" w:cs="Times New Roman" w:eastAsia="Times New Roman" w:hAnsi="Times New Roman"/>
+          <w:sz w:val="20"/>
+          <w:szCs w:val="20"/>
+        </w:rPr>
+        <w:pStyle w:val="Normal"/>
+      </w:pPr>
+      <w:r>
+        <w:t xml:space="preserve">Gemini 2.5 Flash: −23.1pp lift (78.2%→72.3%), McNemar p&lt;0.001, significant negative. The text reference harms Gemini, suggesting generator-model compatibility matters.</w:t>
+      </w:r>
+    </w:p>
+    <w:p>
+      <w:pPr>
+        <w:jc w:val="both"/>
+        <w:rPr>
+          <w:rFonts w:ascii="Times New Roman" w:cs="Times New Roman" w:eastAsia="Times New Roman" w:hAnsi="Times New Roman"/>
+          <w:sz w:val="20"/>
+          <w:szCs w:val="20"/>
+        </w:rPr>
+        <w:pStyle w:val="Normal"/>
+      </w:pPr>
+      <w:r>
+        <w:t xml:space="preserve">Claude Sonnet 4: +6.1pp lift (76.6%→81.2%), McNemar p=0.07, not significant. Reduced but positive effect.</w:t>
+      </w:r>
+    </w:p>
+    <w:p>
+      <w:pPr>
+        <w:jc w:val="both"/>
+        <w:rPr>
+          <w:rFonts w:ascii="Times New Roman" w:cs="Times New Roman" w:eastAsia="Times New Roman" w:hAnsi="Times New Roman"/>
+          <w:sz w:val="20"/>
+          <w:szCs w:val="20"/>
+        </w:rPr>
+        <w:pStyle w:val="Normal"/>
+      </w:pPr>
+      <w:r>
+        <w:t xml:space="preserve">GPT-4.1 Nano: +4.6pp lift (75.3%→80.3%), McNemar p=0.35, not significant. Reduced but positive effect.</w:t>
+      </w:r>
+    </w:p>
+    <w:p>
+      <w:pPr>
+        <w:jc w:val="both"/>
+        <w:rPr>
+          <w:rFonts w:ascii="Times New Roman" w:cs="Times New Roman" w:eastAsia="Times New Roman" w:hAnsi="Times New Roman"/>
+          <w:sz w:val="20"/>
+          <w:szCs w:val="20"/>
+        </w:rPr>
+        <w:pStyle w:val="Normal"/>
+      </w:pPr>
+      <w:r>
+        <w:t xml:space="preserve">GPT-4.1 Mini: +11.6pp lift (61.2%→72.8%), McNemar p=0.013, significant. The largest cross-generator benefit.</w:t>
+      </w:r>
+    </w:p>
+    <w:p>
+      <w:pPr>
+        <w:jc w:val="both"/>
+        <w:rPr>
+          <w:rFonts w:ascii="Times New Roman" w:cs="Times New Roman" w:eastAsia="Times New Roman" w:hAnsi="Times New Roman"/>
+          <w:sz w:val="20"/>
+          <w:szCs w:val="20"/>
+        </w:rPr>
+        <w:pStyle w:val="Normal"/>
+      </w:pPr>
+      <w:r>
+        <w:t xml:space="preserve">GPT-4.1: +8.8pp lift (69.2%→77.6%), McNemar p=0.016, significant. The text-reference benefit is robust under independent generation.</w:t>
+      </w:r>
+    </w:p>
+    <w:p>
+      <w:pPr>
+        <w:jc w:val="both"/>
+        <w:rPr>
+          <w:rFonts w:ascii="Times New Roman" w:cs="Times New Roman" w:eastAsia="Times New Roman" w:hAnsi="Times New Roman"/>
+          <w:sz w:val="20"/>
+          <w:szCs w:val="20"/>
+        </w:rPr>
+        <w:pStyle w:val="Normal"/>
+      </w:pPr>
+      <w:r>
+        <w:t xml:space="preserve">The cross-generator results show a more nuanced picture than the original A→B comparison:</w:t>
+      </w:r>
+    </w:p>
+    <w:p>
+      <w:pPr>
+        <w:jc w:val="both"/>
+        <w:rPr>
+          <w:rFonts w:ascii="Times New Roman" w:cs="Times New Roman" w:eastAsia="Times New Roman" w:hAnsi="Times New Roman"/>
+          <w:sz w:val="20"/>
+          <w:szCs w:val="20"/>
+        </w:rPr>
+        <w:pStyle w:val="Normal"/>
+      </w:pPr>
+      <w:r>
+        <w:t/>
+      </w:r>
+    </w:p>
+    <w:p>
+      <w:pPr>
+        <w:jc w:val="both"/>
+        <w:rPr>
+          <w:rFonts w:ascii="Times New Roman" w:cs="Times New Roman" w:eastAsia="Times New Roman" w:hAnsi="Times New Roman"/>
+          <w:sz w:val="20"/>
+          <w:szCs w:val="20"/>
+        </w:rPr>
+        <w:pStyle w:val="Normal"/>
+      </w:pPr>
+      <w:r>
+        <w:t/>
+      </w:r>
+    </w:p>
+    <w:p>
+      <w:pPr>
+        <w:jc w:val="both"/>
+        <w:rPr>
+          <w:rFonts w:ascii="Times New Roman" w:cs="Times New Roman" w:eastAsia="Times New Roman" w:hAnsi="Times New Roman"/>
+          <w:sz w:val="20"/>
+          <w:szCs w:val="20"/>
+        </w:rPr>
+        <w:pStyle w:val="Normal"/>
+      </w:pPr>
+      <w:r>
+        <w:t xml:space="preserve">Table 7: Cross-generator results (Claude Sonnet 4 references, 147-subset). Acc=accuracy, lift=A−B difference, McNemar p-value vs. A.</w:t>
+      </w:r>
+    </w:p>
+    <w:p>
+      <w:pPr>
+        <w:jc w:val="both"/>
+        <w:rPr>
+          <w:rFonts w:ascii="Times New Roman" w:cs="Times New Roman" w:eastAsia="Times New Roman" w:hAnsi="Times New Roman"/>
+          <w:sz w:val="20"/>
+          <w:szCs w:val="20"/>
+        </w:rPr>
+        <w:pStyle w:val="Normal"/>
+      </w:pPr>
+      <w:r>
+        <w:t/>
+      </w:r>
+    </w:p>
+    <w:p>
+      <w:pPr>
+        <w:jc w:val="both"/>
+        <w:rPr>
+          <w:rFonts w:ascii="Times New Roman" w:cs="Times New Roman" w:eastAsia="Times New Roman" w:hAnsi="Times New Roman"/>
+          <w:sz w:val="20"/>
+          <w:szCs w:val="20"/>
+        </w:rPr>
+        <w:pStyle w:val="Normal"/>
+      </w:pPr>
+      <w:r>
+        <w:t xml:space="preserve">To test whether the text-reference benefit depends on the specific generator model, we regenerated text references using Claude Sonnet 4 as an independent generator. The original references were generated by GPT-4.1 Nano; using a different model controls for self-agreement bias. We re-ran all five verifiers on the 147-instance visual subset.</w:t>
+      </w:r>
+    </w:p>
+    <w:p>
+      <w:pPr>
+        <w:jc w:val="both"/>
+        <w:rPr>
+          <w:rFonts w:ascii="Times New Roman" w:cs="Times New Roman" w:eastAsia="Times New Roman" w:hAnsi="Times New Roman"/>
+          <w:sz w:val="20"/>
+          <w:szCs w:val="20"/>
+        </w:rPr>
+        <w:pStyle w:val="Heading3"/>
+      </w:pPr>
+      <w:r>
+        <w:t xml:space="preserve">5.2.2 Cross-Generator Evaluation</w:t>
+      </w:r>
+    </w:p>
+    <w:p>
+      <w:pPr>
+        <w:jc w:val="both"/>
+        <w:rPr>
           <w:rFonts w:ascii="Helvetica Neue" w:cs="Helvetica Neue" w:eastAsia="Helvetica Neue" w:hAnsi="Helvetica Neue"/>
           <w:b w:val="1"/>
           <w:bCs w:val="1"/>
@@ -18742,7 +19148,7 @@
           <w:szCs w:val="20"/>
           <w:rtl w:val="0"/>
         </w:rPr>
-        <w:t>Consider targeted verification for deceptive failures. While text references showed the largest absolute gains on deceptive failures in the original self-generated comparison, this finding is exploratory (single-annotator taxonomy, Cohen's kappa=0.116) and may not generalize under cross-generator evaluation.</w:t>
+        <w:t>Consider targeted verification for deceptive failures. While text references showed the largest absolute gains on deceptive failures in the original self-generated comparison, this finding is exploratory (single-annotator taxonomy, Cohen's kappa=0.236) and may not generalize under cross-generator evaluation.</w:t>
       </w:r>
       <w:r>
         <w:rPr>
@@ -19114,7 +19520,7 @@
           <w:szCs w:val="20"/>
           <w:rtl w:val="0"/>
         </w:rPr>
-        <w:t>Construct validity. Failure-type categorization is partly subjective; we provide a labeling protocol description and representative examples (Appendix E). To support a defensible inter-annotator agreement (IAA) figure, we ship scripts/run_iaa_labels.py, which samples a 100-instance double-labeling subset and computes Cohen's kappa [27] with the Landis and Koch interpretation [28], and we report a two-annotator inter-annotator agreement study in Section 5.3 (Cohen's kappa=0.116, indicating low agreement). The failure-type taxonomy should be treated as exploratory, with the labeling protocol and representative examples given in Appendix E. Verification is judged from a single final screenshot, which precludes detection of multi-step trajectory errors. Confidence is model-self-reported, which is a noisier elicitation than internal-logit methods [18], [19] and should be interpreted only after calibration analysis (Section 5.5).</w:t>
+        <w:t>Construct validity. Failure-type categorization is partly subjective; we provide a labeling protocol description and representative examples (Appendix E). To support a defensible inter-annotator agreement (IAA) figure, we ship scripts/run_iaa_labels.py, which samples a 100-instance double-labeling subset and computes Cohen's kappa [27] with the Landis and Koch interpretation [28], and we report a two-annotator inter-annotator agreement study in Section 5.3 (Cohen's kappa=0.236, indicating low agreement). The failure-type taxonomy should be treated as exploratory, with the labeling protocol and representative examples given in Appendix E. Verification is judged from a single final screenshot, which precludes detection of multi-step trajectory errors. Confidence is model-self-reported, which is a noisier elicitation than internal-logit methods [18], [19] and should be interpreted only after calibration analysis (Section 5.5).</w:t>
       </w:r>
       <w:r>
         <w:rPr>
@@ -19457,16 +19863,16 @@
           <w:szCs w:val="20"/>
           <w:rtl w:val="0"/>
         </w:rPr>
-        <w:t xml:space="preserve">CITATION.cff</w:t>
-      </w:r>
-      <w:r>
-        <w:rPr>
-          <w:rFonts w:ascii="Times New Roman" w:cs="Times New Roman" w:eastAsia="Times New Roman" w:hAnsi="Times New Roman"/>
-          <w:sz w:val="20"/>
-          <w:szCs w:val="20"/>
-          <w:rtl w:val="0"/>
-        </w:rPr>
-        <w:t xml:space="preserve">.</w:t>
+        <w:t>CITATION.cff</w:t>
+      </w:r>
+      <w:r>
+        <w:rPr>
+          <w:rFonts w:ascii="Times New Roman" w:cs="Times New Roman" w:eastAsia="Times New Roman" w:hAnsi="Times New Roman"/>
+          <w:sz w:val="20"/>
+          <w:szCs w:val="20"/>
+          <w:rtl w:val="0"/>
+        </w:rPr>
+        <w:t xml:space="preserve"> (https://github.com/shravaniparsi/agentic-ui-test).</w:t>
       </w:r>
     </w:p>
     <w:p>

</xml_diff>